<commit_message>
Rewrite all three scripts for a patient audience
These are for Mass General to publish to patients on social media, not for a
Unicode audience. The heart script has exactly one technical beat, the character
code, and nothing else. Matched that register.

Removed: proposal document numbers, Unicode version numbers, pixel dimensions,
weighted kappa, median age, society acronyms, FPS-R and Wong-Baker licensing
detail, "chronic obstructive pulmonary disease."

Kept: the one codepoint beat in the lung script (U+1FAC1), and the explicit
statement in the EbVAS script that the pediatric study has not been run.

All three now land within 20 words of the heart script's 328.

Co-Authored-By: Claude Opus 4.8 <noreply@anthropic.com>
</commit_message>
<xml_diff>
--- a/docs/scripts/BTSEbVAS_PediatricPRO_V1.docx
+++ b/docs/scripts/BTSEbVAS_PediatricPRO_V1.docx
@@ -4,72 +4,67 @@
   <w:body>
     <w:p>
       <w:r>
-        <w:t>He: Ask someone how much pain they are in, and we usually hand them a number. Zero to ten. Zero is nothing. Ten is the worst pain imaginable.</w:t>
+        <w:t>He: When you come to the emergency department in pain, we ask you a strange question. On a scale of zero to ten, how bad is it?</w:t>
       </w:r>
     </w:p>
     <w:p>
       <w:r>
-        <w:t>He: That scale works, and it has worked for decades. But it assumes the person in front of you can turn a feeling into a number, in a language they read, on a day when they are frightened and unwell.</w:t>
+        <w:t>He: That question works, and we have used it for decades. But it asks you to turn a feeling into a number, in a language you may not speak, on what might be the worst day of your life.</w:t>
       </w:r>
     </w:p>
     <w:p>
       <w:r>
-        <w:t>He: A few years ago we tested whether emoji could do the same job. We called it the Emoji Based Visual Analogue Scale, or EbVAS.</w:t>
+        <w:t>He: A few years ago we wondered whether emoji could do the same job. We built a pain scale out of six faces, and we called it the Emoji Based Visual Analogue Scale.</w:t>
       </w:r>
     </w:p>
     <w:p>
       <w:r>
-        <w:t>He: We surveyed 109 patients at Massachusetts General Hospital, in the emergency department and on the surgical units. Every patient rated their pain twice. Once on the standard zero to ten scale, and once on a scale made of six emoji faces. We randomized which one they saw first.</w:t>
+        <w:t>He: We asked one hundred and nine patients here at Massachusetts General Hospital to rate their pain twice. Once with the usual numbers, and once with the faces. We changed the order at random, so that nobody was steered by whichever one they saw first.</w:t>
       </w:r>
     </w:p>
     <w:p>
       <w:r>
-        <w:t>He: The two scales agreed. The weighted kappa was 0.84, which is strong agreement. The median pain score was four on the numeric scale, and four on the emoji scale.</w:t>
+        <w:t>He: The two scales agreed closely. The typical patient landed on the same score either way.</w:t>
       </w:r>
     </w:p>
     <w:p>
       <w:r>
-        <w:t>He: We published that in JAMA in 2022.</w:t>
+        <w:t>He: We published that in the Journal of the American Medical Association in 2022.</w:t>
       </w:r>
     </w:p>
     <w:p>
       <w:r>
-        <w:t>He: What that study established is narrow, and it is real. An emoji scale is not decoration. It measures the same thing the number measures. Emoji have a role in how patients tell us what is happening to them.</w:t>
+        <w:t>He: What it tells us is simple. The faces are not decoration. They measure the same thing the numbers measure. Emoji can carry real medical information between a patient and a doctor.</w:t>
       </w:r>
     </w:p>
     <w:p>
       <w:r>
-        <w:t>He: Which brings me to the patients I actually think about when I look at that result. Children.</w:t>
+        <w:t>He: Which makes me think about the patients who cannot use the numbers at all. Children.</w:t>
       </w:r>
     </w:p>
     <w:p>
       <w:r>
-        <w:t>He: A child can usually give you a reliable number somewhere around the age of eight. Below that, numbers stop working. This is why pediatrics has used faces instead for more than forty years.</w:t>
+        <w:t>He: A child can usually give you a reliable number somewhere around the age of eight. Younger than that, numbers stop working. This is why pediatrics has used faces instead for more than forty years.</w:t>
       </w:r>
     </w:p>
     <w:p>
       <w:r>
-        <w:t>He: Those face scales are good. The Wong Baker FACES scale and the Faces Pain Scale Revised are validated, they are widely used, and children understand them.</w:t>
+        <w:t>He: Those face scales are good, and children understand them. But they belong to someone. Putting them in an app, or changing them to fit a child in front of you, means asking permission and sometimes paying for it.</w:t>
       </w:r>
     </w:p>
     <w:p>
       <w:r>
-        <w:t>He: They are also owned. Wong Baker is copyrighted, and modifying it or publishing it requires a licensing agreement. The Faces Pain Scale Revised is free to use in the clinic, but you cannot alter it without permission.</w:t>
+        <w:t>He: Emoji belong to no one. They already sit on the phone in a parent’s hand, in nearly every language on earth, and anybody can use them for free.</w:t>
       </w:r>
     </w:p>
     <w:p>
       <w:r>
-        <w:t>He: An emoji scale has a property that none of them have. It already lives inside Unicode, which means it is already on the phone in the parent’s hand. No one holds a license on it. Anyone can modify it, translate it, or drop it into a telehealth app or an electronic medical record without asking permission from anybody.</w:t>
+        <w:t>He: Now here is the part I want to be honest about. We have not tested this in children yet. Everyone in our study was an adult. Until that work is done, an emoji pain scale is a promising idea for children, and not a proven one.</w:t>
       </w:r>
     </w:p>
     <w:p>
       <w:r>
-        <w:t>He: Now here is what we have not done. We have not run this study in children. Our patients were adults, with a median age of sixty five. Until somebody enrolls children, an emoji pain scale is a promising idea in pediatrics and not a validated one.</w:t>
-      </w:r>
-    </w:p>
-    <w:p>
-      <w:r>
-        <w:t>He: I would like us to be the group that does it. If you work in pediatric pain and this sounds worth testing, come find us.</w:t>
+        <w:t>He: I would like us to be the ones who do it.</w:t>
       </w:r>
     </w:p>
     <w:sectPr>

</xml_diff>

<commit_message>
Tighten the advocacy script and cut the EbVAS script hard
Advocacy 345 to 293 words. EbVAS 384 to 245, the shortest of the three.

Cut from EbVAS: the instrument's formal name, the forty-years-of-faces
history, and the Wong-Baker licensing argument. The closing admission that
no pediatric study has been run stays. It is the point of the script.

Co-Authored-By: Claude Opus 4.8 <noreply@anthropic.com>
</commit_message>
<xml_diff>
--- a/docs/scripts/BTSEbVAS_PediatricPRO_V1.docx
+++ b/docs/scripts/BTSEbVAS_PediatricPRO_V1.docx
@@ -9,57 +9,37 @@
     </w:p>
     <w:p>
       <w:r>
-        <w:t>He: That question works, and we have used it for decades. But it asks you to turn a feeling into a number, in a language you may not speak, on what might be the worst day of your life.</w:t>
+        <w:t>He: That question works. But it asks you to turn a feeling into a number, in a language you may not speak, on what might be the worst day of your life.</w:t>
       </w:r>
     </w:p>
     <w:p>
       <w:r>
-        <w:t>He: A few years ago we wondered whether emoji could do the same job. We built a pain scale out of six faces, and we called it the Emoji Based Visual Analogue Scale.</w:t>
+        <w:t>He: So we built a pain scale out of six emoji faces, and we tested it here at Mass General. One hundred and nine patients rated their pain twice. Once with the numbers, and once with the faces.</w:t>
       </w:r>
     </w:p>
     <w:p>
       <w:r>
-        <w:t>He: We asked one hundred and nine patients here at Massachusetts General Hospital to rate their pain twice. Once with the usual numbers, and once with the faces. We changed the order at random, so that nobody was steered by whichever one they saw first.</w:t>
+        <w:t>He: The two agreed closely. The typical patient landed on the same score either way. We published it in the Journal of the American Medical Association.</w:t>
       </w:r>
     </w:p>
     <w:p>
       <w:r>
-        <w:t>He: The two scales agreed closely. The typical patient landed on the same score either way.</w:t>
+        <w:t>He: The faces are not decoration. They measure what the numbers measure.</w:t>
       </w:r>
     </w:p>
     <w:p>
       <w:r>
-        <w:t>He: We published that in the Journal of the American Medical Association in 2022.</w:t>
+        <w:t>He: Which makes me think about the patients who cannot use numbers at all. Children. A child can usually give you a reliable number somewhere around the age of eight. Younger than that, numbers stop working.</w:t>
       </w:r>
     </w:p>
     <w:p>
       <w:r>
-        <w:t>He: What it tells us is simple. The faces are not decoration. They measure the same thing the numbers measure. Emoji can carry real medical information between a patient and a doctor.</w:t>
+        <w:t>He: Emoji are already sitting on the phone in a parent’s hand, in nearly every language on earth, and anybody can use them for free.</w:t>
       </w:r>
     </w:p>
     <w:p>
       <w:r>
-        <w:t>He: Which makes me think about the patients who cannot use the numbers at all. Children.</w:t>
-      </w:r>
-    </w:p>
-    <w:p>
-      <w:r>
-        <w:t>He: A child can usually give you a reliable number somewhere around the age of eight. Younger than that, numbers stop working. This is why pediatrics has used faces instead for more than forty years.</w:t>
-      </w:r>
-    </w:p>
-    <w:p>
-      <w:r>
-        <w:t>He: Those face scales are good, and children understand them. But they belong to someone. Putting them in an app, or changing them to fit a child in front of you, means asking permission and sometimes paying for it.</w:t>
-      </w:r>
-    </w:p>
-    <w:p>
-      <w:r>
-        <w:t>He: Emoji belong to no one. They already sit on the phone in a parent’s hand, in nearly every language on earth, and anybody can use them for free.</w:t>
-      </w:r>
-    </w:p>
-    <w:p>
-      <w:r>
-        <w:t>He: Now here is the part I want to be honest about. We have not tested this in children yet. Everyone in our study was an adult. Until that work is done, an emoji pain scale is a promising idea for children, and not a proven one.</w:t>
+        <w:t>He: Now here is the honest part. We have not tested this in children yet. Everyone in our study was an adult. Until that work is done, it is a promising idea and not a proven one.</w:t>
       </w:r>
     </w:p>
     <w:p>

</xml_diff>

<commit_message>
Reframe EbVAS script around the digital faces scale, drop pediatrics
New spine: everyone already knows the drawn faces scale, but it lives on a card
in the clinic. Ours is built from the emoji already in the patient's keyboard,
so pain can be reported from home. The JAMA study is the proof that emoji carry
real clinical information.

Removed the pediatric audience and, with it, the limitations paragraph. The
caveat existed only to guard the pediatric claim. With no claim there is nothing
to disclaim, and the script now says nothing the 2022 study cannot support.

The markdown header notes that children and the not-yet-tested line travel
together, so a future editor cannot reintroduce one without the other.

Co-Authored-By: Claude Opus 4.8 <noreply@anthropic.com>
</commit_message>
<xml_diff>
--- a/docs/scripts/BTSEbVAS_PediatricPRO_V1.docx
+++ b/docs/scripts/BTSEbVAS_PediatricPRO_V1.docx
@@ -4,47 +4,47 @@
   <w:body>
     <w:p>
       <w:r>
-        <w:t>He: When you come to the emergency department in pain, we ask you a strange question. On a scale of zero to ten, how bad is it?</w:t>
+        <w:t>He: If you have ever been in a hospital, you have seen the faces scale. A row of drawn faces on a card or a poster, running from comfortable to miserable. Point at the one that looks like how you feel.</w:t>
       </w:r>
     </w:p>
     <w:p>
       <w:r>
-        <w:t>He: That question works. But it asks you to turn a feeling into a number, in a language you may not speak, on what might be the worst day of your life.</w:t>
+        <w:t>He: It has been used for about forty years because it works. It works for people who do not read the language printed on the chart, and for anyone too exhausted to do arithmetic about their own pain.</w:t>
       </w:r>
     </w:p>
     <w:p>
       <w:r>
-        <w:t>He: So we built a pain scale out of six emoji faces, and we tested it here at Mass General. One hundred and nine patients rated their pain twice. Once with the numbers, and once with the faces.</w:t>
+        <w:t>He: But that scale lives in the clinic. It is a card in a drawer, or a poster taped to a wall. When you go home, it stays behind. The pain you have at two in the morning, three days after surgery, is the pain that nobody measures.</w:t>
       </w:r>
     </w:p>
     <w:p>
       <w:r>
-        <w:t>He: The two agreed closely. The typical patient landed on the same score either way. We published it in the Journal of the American Medical Association.</w:t>
+        <w:t>He: So we rebuilt the faces scale out of emoji. Not a picture we send to you, but the characters that are already sitting in the keyboard of your own phone.</w:t>
       </w:r>
     </w:p>
     <w:p>
       <w:r>
-        <w:t>He: The faces are not decoration. They measure what the numbers measure.</w:t>
+        <w:t>He: We tested it here at Mass General. One hundred and nine patients rated their pain twice. Once with the usual zero to ten numbers, and once with the faces.</w:t>
       </w:r>
     </w:p>
     <w:p>
       <w:r>
-        <w:t>He: Which makes me think about the patients who cannot use numbers at all. Children. A child can usually give you a reliable number somewhere around the age of eight. Younger than that, numbers stop working.</w:t>
+        <w:t>He: The two agreed closely. The typical patient landed on the same score either way. We published that in the Journal of the American Medical Association.</w:t>
       </w:r>
     </w:p>
     <w:p>
       <w:r>
-        <w:t>He: Emoji are already sitting on the phone in a parent’s hand, in nearly every language on earth, and anybody can use them for free.</w:t>
+        <w:t>He: That is the part I want people to understand. The emoji are not decoration. They measure what the numbers measure. Emoji have become a real part of how patients tell us what is happening inside them.</w:t>
       </w:r>
     </w:p>
     <w:p>
       <w:r>
-        <w:t>He: Now here is the honest part. We have not tested this in children yet. Everyone in our study was an adult. Until that work is done, it is a promising idea and not a proven one.</w:t>
+        <w:t>He: And because they are already on your phone, you can use them from your own kitchen table. In a message to your doctor. In a telehealth visit. In nearly any language on earth, for free.</w:t>
       </w:r>
     </w:p>
     <w:p>
       <w:r>
-        <w:t>He: I would like us to be the ones who do it.</w:t>
+        <w:t>He: Emoji began as a way for people to say how they feel. That turns out to be exactly what medicine has been asking patients to do all along.</w:t>
       </w:r>
     </w:p>
     <w:sectPr>

</xml_diff>